<commit_message>
Updated version of the final report
</commit_message>
<xml_diff>
--- a/results/reports/final_report.docx
+++ b/results/reports/final_report.docx
@@ -4,6 +4,59 @@
   <w:body>
     <w:p>
       <w:pPr>
+        <w:jc w:val="center"/>
+        <w:rPr>
+          <w:lang w:val="en-GB"/>
+        </w:rPr>
+      </w:pPr>
+      <w:r>
+        <w:rPr>
+          <w:sz w:val="52"/>
+          <w:szCs w:val="52"/>
+          <w:lang w:val="en-GB"/>
+        </w:rPr>
+        <w:t>Preliminary Assignment Summary</w:t>
+      </w:r>
+    </w:p>
+    <w:p>
+      <w:pPr>
+        <w:rPr>
+          <w:lang w:val="en-GB"/>
+        </w:rPr>
+      </w:pPr>
+    </w:p>
+    <w:p>
+      <w:pPr>
+        <w:pStyle w:val="ListParagraph"/>
+        <w:numPr>
+          <w:ilvl w:val="0"/>
+          <w:numId w:val="2"/>
+        </w:numPr>
+        <w:rPr>
+          <w:sz w:val="32"/>
+          <w:szCs w:val="32"/>
+          <w:lang w:val="en-GB"/>
+        </w:rPr>
+      </w:pPr>
+      <w:r>
+        <w:rPr>
+          <w:sz w:val="32"/>
+          <w:szCs w:val="32"/>
+          <w:lang w:val="en-GB"/>
+        </w:rPr>
+        <w:t xml:space="preserve">Quality of the </w:t>
+      </w:r>
+      <w:r>
+        <w:rPr>
+          <w:sz w:val="32"/>
+          <w:szCs w:val="32"/>
+          <w:lang w:val="en-GB"/>
+        </w:rPr>
+        <w:t>data</w:t>
+      </w:r>
+    </w:p>
+    <w:p>
+      <w:pPr>
         <w:rPr>
           <w:lang w:val="en-GB"/>
         </w:rPr>
@@ -18,7 +71,19 @@
         <w:rPr>
           <w:lang w:val="en-GB"/>
         </w:rPr>
-        <w:t>icture provided have different qualities. Some of them have an higher resolution that can help noticing some details (</w:t>
+        <w:t>icture</w:t>
+      </w:r>
+      <w:r>
+        <w:rPr>
+          <w:lang w:val="en-GB"/>
+        </w:rPr>
+        <w:t>s</w:t>
+      </w:r>
+      <w:r>
+        <w:rPr>
+          <w:lang w:val="en-GB"/>
+        </w:rPr>
+        <w:t xml:space="preserve"> provided have different qualities. Some of them have an higher resolution that can help noticing some details (</w:t>
       </w:r>
       <w:r>
         <w:rPr>
@@ -134,10 +199,10 @@
           <w:lang w:val="en-GB"/>
         </w:rPr>
         <w:drawing>
-          <wp:inline distT="0" distB="0" distL="0" distR="0" wp14:anchorId="4F0ECB7E" wp14:editId="5183BA6D">
+          <wp:inline distT="0" distB="0" distL="0" distR="0" wp14:anchorId="4F0ECB7E" wp14:editId="3D5304FB">
             <wp:extent cx="1727200" cy="1727200"/>
             <wp:effectExtent l="0" t="0" r="0" b="0"/>
-            <wp:docPr id="1895666688" name="Picture 2" descr="A close up of a circle&#10;&#10;AI-generated content may be incorrect."/>
+            <wp:docPr id="1895666688" name="Picture 2"/>
             <wp:cNvGraphicFramePr>
               <a:graphicFrameLocks xmlns:a="http://schemas.openxmlformats.org/drawingml/2006/main" noChangeAspect="1"/>
             </wp:cNvGraphicFramePr>
@@ -145,11 +210,11 @@
               <a:graphicData uri="http://schemas.openxmlformats.org/drawingml/2006/picture">
                 <pic:pic xmlns:pic="http://schemas.openxmlformats.org/drawingml/2006/picture">
                   <pic:nvPicPr>
-                    <pic:cNvPr id="1895666688" name="Picture 2" descr="A close up of a circle&#10;&#10;AI-generated content may be incorrect."/>
+                    <pic:cNvPr id="1895666688" name="Picture 2"/>
                     <pic:cNvPicPr/>
                   </pic:nvPicPr>
                   <pic:blipFill>
-                    <a:blip r:embed="rId6" cstate="print">
+                    <a:blip r:embed="rId6">
                       <a:extLst>
                         <a:ext uri="{28A0092B-C50C-407E-A947-70E740481C1C}">
                           <a14:useLocalDpi xmlns:a14="http://schemas.microsoft.com/office/drawing/2010/main" val="0"/>
@@ -237,51 +302,14 @@
       </w:pPr>
       <w:r>
         <w:rPr>
-          <w:lang w:val="en-GB"/>
-        </w:rPr>
-        <w:t>Some of them are darker and other lighter not because of the actual colour but because of the light exposure (</w:t>
-      </w:r>
-      <w:r>
-        <w:rPr>
-          <w:lang w:val="en-GB"/>
-        </w:rPr>
-        <w:t>PAT_115_177_622.png</w:t>
-      </w:r>
-      <w:r>
-        <w:rPr>
-          <w:lang w:val="en-GB"/>
-        </w:rPr>
-        <w:t xml:space="preserve">, </w:t>
-      </w:r>
-      <w:r>
-        <w:rPr>
-          <w:lang w:val="en-GB"/>
-        </w:rPr>
-        <w:t>PAT_134_201_587.png</w:t>
-      </w:r>
-      <w:r>
-        <w:rPr>
-          <w:lang w:val="en-GB"/>
-        </w:rPr>
-        <w:t>).</w:t>
-      </w:r>
-    </w:p>
-    <w:p>
-      <w:pPr>
-        <w:rPr>
-          <w:lang w:val="en-GB"/>
-        </w:rPr>
-      </w:pPr>
-      <w:r>
-        <w:rPr>
           <w:noProof/>
           <w:lang w:val="en-GB"/>
         </w:rPr>
         <w:drawing>
-          <wp:inline distT="0" distB="0" distL="0" distR="0" wp14:anchorId="6C88CFE2" wp14:editId="5A5531F9">
+          <wp:inline distT="0" distB="0" distL="0" distR="0" wp14:anchorId="791F8EEA" wp14:editId="1AF0980B">
             <wp:extent cx="1727200" cy="1727200"/>
             <wp:effectExtent l="0" t="0" r="0" b="0"/>
-            <wp:docPr id="2110346079" name="Picture 4"/>
+            <wp:docPr id="890271183" name="Picture 1"/>
             <wp:cNvGraphicFramePr>
               <a:graphicFrameLocks xmlns:a="http://schemas.openxmlformats.org/drawingml/2006/main" noChangeAspect="1"/>
             </wp:cNvGraphicFramePr>
@@ -289,7 +317,7 @@
               <a:graphicData uri="http://schemas.openxmlformats.org/drawingml/2006/picture">
                 <pic:pic xmlns:pic="http://schemas.openxmlformats.org/drawingml/2006/picture">
                   <pic:nvPicPr>
-                    <pic:cNvPr id="2110346079" name="Picture 2110346079"/>
+                    <pic:cNvPr id="890271183" name="Picture 1"/>
                     <pic:cNvPicPr/>
                   </pic:nvPicPr>
                   <pic:blipFill>
@@ -331,10 +359,10 @@
           <w:lang w:val="en-GB"/>
         </w:rPr>
         <w:drawing>
-          <wp:inline distT="0" distB="0" distL="0" distR="0" wp14:anchorId="5F520B85" wp14:editId="2FBF560E">
+          <wp:inline distT="0" distB="0" distL="0" distR="0" wp14:anchorId="7631CE69" wp14:editId="45DF19E1">
             <wp:extent cx="1727200" cy="1727200"/>
             <wp:effectExtent l="0" t="0" r="0" b="0"/>
-            <wp:docPr id="2137356732" name="Picture 5" descr="Close up of a person's face with red skin&#10;&#10;AI-generated content may be incorrect."/>
+            <wp:docPr id="389938569" name="Picture 2"/>
             <wp:cNvGraphicFramePr>
               <a:graphicFrameLocks xmlns:a="http://schemas.openxmlformats.org/drawingml/2006/main" noChangeAspect="1"/>
             </wp:cNvGraphicFramePr>
@@ -342,11 +370,115 @@
               <a:graphicData uri="http://schemas.openxmlformats.org/drawingml/2006/picture">
                 <pic:pic xmlns:pic="http://schemas.openxmlformats.org/drawingml/2006/picture">
                   <pic:nvPicPr>
-                    <pic:cNvPr id="2137356732" name="Picture 5" descr="Close up of a person's face with red skin&#10;&#10;AI-generated content may be incorrect."/>
+                    <pic:cNvPr id="389938569" name="Picture 2"/>
                     <pic:cNvPicPr/>
                   </pic:nvPicPr>
                   <pic:blipFill>
                     <a:blip r:embed="rId9" cstate="print">
+                      <a:extLst>
+                        <a:ext uri="{28A0092B-C50C-407E-A947-70E740481C1C}">
+                          <a14:useLocalDpi xmlns:a14="http://schemas.microsoft.com/office/drawing/2010/main" val="0"/>
+                        </a:ext>
+                      </a:extLst>
+                    </a:blip>
+                    <a:stretch>
+                      <a:fillRect/>
+                    </a:stretch>
+                  </pic:blipFill>
+                  <pic:spPr>
+                    <a:xfrm flipV="1">
+                      <a:off x="0" y="0"/>
+                      <a:ext cx="1727200" cy="1727200"/>
+                    </a:xfrm>
+                    <a:prstGeom prst="rect">
+                      <a:avLst/>
+                    </a:prstGeom>
+                  </pic:spPr>
+                </pic:pic>
+              </a:graphicData>
+            </a:graphic>
+          </wp:inline>
+        </w:drawing>
+      </w:r>
+      <w:r>
+        <w:rPr>
+          <w:lang w:val="en-GB"/>
+        </w:rPr>
+        <w:t xml:space="preserve">  </w:t>
+      </w:r>
+    </w:p>
+    <w:p>
+      <w:pPr>
+        <w:rPr>
+          <w:lang w:val="en-GB"/>
+        </w:rPr>
+      </w:pPr>
+    </w:p>
+    <w:p>
+      <w:pPr>
+        <w:rPr>
+          <w:lang w:val="en-GB"/>
+        </w:rPr>
+      </w:pPr>
+      <w:r>
+        <w:rPr>
+          <w:lang w:val="en-GB"/>
+        </w:rPr>
+        <w:t>Some of them are darker and other lighter not because of the actual colour but because of the light exposure (</w:t>
+      </w:r>
+      <w:r>
+        <w:rPr>
+          <w:lang w:val="en-GB"/>
+        </w:rPr>
+        <w:t>PAT_115_177_622.png</w:t>
+      </w:r>
+      <w:r>
+        <w:rPr>
+          <w:lang w:val="en-GB"/>
+        </w:rPr>
+        <w:t xml:space="preserve">, </w:t>
+      </w:r>
+      <w:r>
+        <w:rPr>
+          <w:lang w:val="en-GB"/>
+        </w:rPr>
+        <w:t>PAT_134_201_587.png</w:t>
+      </w:r>
+      <w:r>
+        <w:rPr>
+          <w:lang w:val="en-GB"/>
+        </w:rPr>
+        <w:t>).</w:t>
+      </w:r>
+    </w:p>
+    <w:p>
+      <w:pPr>
+        <w:rPr>
+          <w:lang w:val="en-GB"/>
+        </w:rPr>
+      </w:pPr>
+      <w:r>
+        <w:rPr>
+          <w:noProof/>
+          <w:lang w:val="en-GB"/>
+        </w:rPr>
+        <w:drawing>
+          <wp:inline distT="0" distB="0" distL="0" distR="0" wp14:anchorId="6C88CFE2" wp14:editId="5A5531F9">
+            <wp:extent cx="1727200" cy="1727200"/>
+            <wp:effectExtent l="0" t="0" r="0" b="0"/>
+            <wp:docPr id="2110346079" name="Picture 4"/>
+            <wp:cNvGraphicFramePr>
+              <a:graphicFrameLocks xmlns:a="http://schemas.openxmlformats.org/drawingml/2006/main" noChangeAspect="1"/>
+            </wp:cNvGraphicFramePr>
+            <a:graphic xmlns:a="http://schemas.openxmlformats.org/drawingml/2006/main">
+              <a:graphicData uri="http://schemas.openxmlformats.org/drawingml/2006/picture">
+                <pic:pic xmlns:pic="http://schemas.openxmlformats.org/drawingml/2006/picture">
+                  <pic:nvPicPr>
+                    <pic:cNvPr id="2110346079" name="Picture 2110346079"/>
+                    <pic:cNvPicPr/>
+                  </pic:nvPicPr>
+                  <pic:blipFill>
+                    <a:blip r:embed="rId10" cstate="print">
                       <a:extLst>
                         <a:ext uri="{28A0092B-C50C-407E-A947-70E740481C1C}">
                           <a14:useLocalDpi xmlns:a14="http://schemas.microsoft.com/office/drawing/2010/main" val="0"/>
@@ -372,60 +504,22 @@
           </wp:inline>
         </w:drawing>
       </w:r>
-    </w:p>
-    <w:p>
-      <w:pPr>
-        <w:rPr>
-          <w:lang w:val="en-GB"/>
-        </w:rPr>
-      </w:pPr>
-      <w:r>
-        <w:rPr>
-          <w:lang w:val="en-GB"/>
-        </w:rPr>
-        <w:t xml:space="preserve">In some of the picture you can easily recognise the part of the body that was photographed like </w:t>
-      </w:r>
-      <w:r>
-        <w:rPr>
-          <w:lang w:val="en-GB"/>
-        </w:rPr>
-        <w:t>PAT_294_638_564.png</w:t>
-      </w:r>
-      <w:r>
-        <w:rPr>
-          <w:lang w:val="en-GB"/>
-        </w:rPr>
-        <w:t xml:space="preserve"> and </w:t>
-      </w:r>
-      <w:r>
-        <w:rPr>
-          <w:lang w:val="en-GB"/>
-        </w:rPr>
-        <w:t>PAT_87_133_391.png</w:t>
-      </w:r>
-      <w:r>
-        <w:rPr>
-          <w:lang w:val="en-GB"/>
-        </w:rPr>
-        <w:t xml:space="preserve"> but other are difficult to locate.</w:t>
-      </w:r>
-    </w:p>
-    <w:p>
-      <w:pPr>
-        <w:rPr>
-          <w:lang w:val="en-GB"/>
-        </w:rPr>
-      </w:pPr>
+      <w:r>
+        <w:rPr>
+          <w:lang w:val="en-GB"/>
+        </w:rPr>
+        <w:t xml:space="preserve">  </w:t>
+      </w:r>
       <w:r>
         <w:rPr>
           <w:noProof/>
           <w:lang w:val="en-GB"/>
         </w:rPr>
         <w:drawing>
-          <wp:inline distT="0" distB="0" distL="0" distR="0" wp14:anchorId="604A2E70" wp14:editId="7D0762E2">
-            <wp:extent cx="1676400" cy="1676400"/>
+          <wp:inline distT="0" distB="0" distL="0" distR="0" wp14:anchorId="5F520B85" wp14:editId="2FBF560E">
+            <wp:extent cx="1727200" cy="1727200"/>
             <wp:effectExtent l="0" t="0" r="0" b="0"/>
-            <wp:docPr id="758711259" name="Picture 6" descr="A close up of a mole on a person's skin&#10;&#10;AI-generated content may be incorrect."/>
+            <wp:docPr id="2137356732" name="Picture 5" descr="Close up of a person's face with red skin&#10;&#10;AI-generated content may be incorrect."/>
             <wp:cNvGraphicFramePr>
               <a:graphicFrameLocks xmlns:a="http://schemas.openxmlformats.org/drawingml/2006/main" noChangeAspect="1"/>
             </wp:cNvGraphicFramePr>
@@ -433,11 +527,11 @@
               <a:graphicData uri="http://schemas.openxmlformats.org/drawingml/2006/picture">
                 <pic:pic xmlns:pic="http://schemas.openxmlformats.org/drawingml/2006/picture">
                   <pic:nvPicPr>
-                    <pic:cNvPr id="758711259" name="Picture 6" descr="A close up of a mole on a person's skin&#10;&#10;AI-generated content may be incorrect."/>
+                    <pic:cNvPr id="2137356732" name="Picture 5" descr="Close up of a person's face with red skin&#10;&#10;AI-generated content may be incorrect."/>
                     <pic:cNvPicPr/>
                   </pic:nvPicPr>
                   <pic:blipFill>
-                    <a:blip r:embed="rId10">
+                    <a:blip r:embed="rId11" cstate="print">
                       <a:extLst>
                         <a:ext uri="{28A0092B-C50C-407E-A947-70E740481C1C}">
                           <a14:useLocalDpi xmlns:a14="http://schemas.microsoft.com/office/drawing/2010/main" val="0"/>
@@ -451,7 +545,7 @@
                   <pic:spPr>
                     <a:xfrm>
                       <a:off x="0" y="0"/>
-                      <a:ext cx="1676400" cy="1676400"/>
+                      <a:ext cx="1727200" cy="1727200"/>
                     </a:xfrm>
                     <a:prstGeom prst="rect">
                       <a:avLst/>
@@ -463,92 +557,72 @@
           </wp:inline>
         </w:drawing>
       </w:r>
+    </w:p>
+    <w:p>
+      <w:pPr>
+        <w:rPr>
+          <w:lang w:val="en-GB"/>
+        </w:rPr>
+      </w:pPr>
+    </w:p>
+    <w:p>
+      <w:pPr>
+        <w:rPr>
+          <w:lang w:val="en-GB"/>
+        </w:rPr>
+      </w:pPr>
+    </w:p>
+    <w:p>
+      <w:pPr>
+        <w:rPr>
+          <w:lang w:val="en-GB"/>
+        </w:rPr>
+      </w:pPr>
+    </w:p>
+    <w:p>
+      <w:pPr>
+        <w:rPr>
+          <w:lang w:val="en-GB"/>
+        </w:rPr>
+      </w:pPr>
       <w:r>
         <w:rPr>
           <w:lang w:val="en-GB"/>
         </w:rPr>
         <w:t xml:space="preserve">  </w:t>
       </w:r>
-      <w:r>
-        <w:rPr>
-          <w:noProof/>
-          <w:lang w:val="en-GB"/>
-        </w:rPr>
-        <w:drawing>
-          <wp:inline distT="0" distB="0" distL="0" distR="0" wp14:anchorId="70C5410B" wp14:editId="0EB3428D">
-            <wp:extent cx="1663700" cy="1663700"/>
-            <wp:effectExtent l="0" t="0" r="0" b="0"/>
-            <wp:docPr id="1647777853" name="Picture 7" descr="A close up of a person's skin&#10;&#10;AI-generated content may be incorrect."/>
-            <wp:cNvGraphicFramePr>
-              <a:graphicFrameLocks xmlns:a="http://schemas.openxmlformats.org/drawingml/2006/main" noChangeAspect="1"/>
-            </wp:cNvGraphicFramePr>
-            <a:graphic xmlns:a="http://schemas.openxmlformats.org/drawingml/2006/main">
-              <a:graphicData uri="http://schemas.openxmlformats.org/drawingml/2006/picture">
-                <pic:pic xmlns:pic="http://schemas.openxmlformats.org/drawingml/2006/picture">
-                  <pic:nvPicPr>
-                    <pic:cNvPr id="1647777853" name="Picture 7" descr="A close up of a person's skin&#10;&#10;AI-generated content may be incorrect."/>
-                    <pic:cNvPicPr/>
-                  </pic:nvPicPr>
-                  <pic:blipFill>
-                    <a:blip r:embed="rId11">
-                      <a:extLst>
-                        <a:ext uri="{28A0092B-C50C-407E-A947-70E740481C1C}">
-                          <a14:useLocalDpi xmlns:a14="http://schemas.microsoft.com/office/drawing/2010/main" val="0"/>
-                        </a:ext>
-                      </a:extLst>
-                    </a:blip>
-                    <a:stretch>
-                      <a:fillRect/>
-                    </a:stretch>
-                  </pic:blipFill>
-                  <pic:spPr>
-                    <a:xfrm>
-                      <a:off x="0" y="0"/>
-                      <a:ext cx="1663700" cy="1663700"/>
-                    </a:xfrm>
-                    <a:prstGeom prst="rect">
-                      <a:avLst/>
-                    </a:prstGeom>
-                  </pic:spPr>
-                </pic:pic>
-              </a:graphicData>
-            </a:graphic>
-          </wp:inline>
-        </w:drawing>
-      </w:r>
-    </w:p>
-    <w:p>
-      <w:pPr>
-        <w:rPr>
-          <w:lang w:val="en-GB"/>
-        </w:rPr>
-      </w:pPr>
-    </w:p>
-    <w:p>
-      <w:pPr>
-        <w:rPr>
-          <w:lang w:val="en-GB"/>
-        </w:rPr>
-      </w:pPr>
-    </w:p>
-    <w:p>
-      <w:pPr>
-        <w:rPr>
-          <w:lang w:val="en-GB"/>
-        </w:rPr>
-      </w:pPr>
-    </w:p>
-    <w:p>
-      <w:pPr>
-        <w:rPr>
-          <w:lang w:val="en-GB"/>
-        </w:rPr>
-      </w:pPr>
-      <w:r>
-        <w:rPr>
-          <w:lang w:val="en-GB"/>
-        </w:rPr>
-        <w:lastRenderedPageBreak/>
+    </w:p>
+    <w:p>
+      <w:pPr>
+        <w:rPr>
+          <w:lang w:val="en-GB"/>
+        </w:rPr>
+      </w:pPr>
+    </w:p>
+    <w:p>
+      <w:pPr>
+        <w:rPr>
+          <w:lang w:val="en-GB"/>
+        </w:rPr>
+      </w:pPr>
+    </w:p>
+    <w:p>
+      <w:pPr>
+        <w:rPr>
+          <w:lang w:val="en-GB"/>
+        </w:rPr>
+      </w:pPr>
+    </w:p>
+    <w:p>
+      <w:pPr>
+        <w:rPr>
+          <w:lang w:val="en-GB"/>
+        </w:rPr>
+      </w:pPr>
+      <w:r>
+        <w:rPr>
+          <w:lang w:val="en-GB"/>
+        </w:rPr>
         <w:t xml:space="preserve">In some of the pictures we can ignore the deformation made by the photography because the skin can be approximated to a plan but in other cases the anatomy of the body has not to be excluded and the lesion is placed on a curve. </w:t>
       </w:r>
       <w:r>
@@ -650,7 +724,7 @@
                     <pic:cNvPicPr/>
                   </pic:nvPicPr>
                   <pic:blipFill>
-                    <a:blip r:embed="rId11">
+                    <a:blip r:embed="rId13">
                       <a:extLst>
                         <a:ext uri="{28A0092B-C50C-407E-A947-70E740481C1C}">
                           <a14:useLocalDpi xmlns:a14="http://schemas.microsoft.com/office/drawing/2010/main" val="0"/>
@@ -693,6 +767,74 @@
     </w:p>
     <w:p>
       <w:pPr>
+        <w:rPr>
+          <w:lang w:val="en-GB"/>
+        </w:rPr>
+      </w:pPr>
+      <w:r>
+        <w:rPr>
+          <w:lang w:val="en-GB"/>
+        </w:rPr>
+        <w:t>Add the part about the mask</w:t>
+      </w:r>
+    </w:p>
+    <w:p>
+      <w:pPr>
+        <w:rPr>
+          <w:lang w:val="en-GB"/>
+        </w:rPr>
+      </w:pPr>
+    </w:p>
+    <w:p>
+      <w:pPr>
+        <w:rPr>
+          <w:lang w:val="en-GB"/>
+        </w:rPr>
+      </w:pPr>
+    </w:p>
+    <w:p>
+      <w:pPr>
+        <w:rPr>
+          <w:lang w:val="en-GB"/>
+        </w:rPr>
+      </w:pPr>
+      <w:r>
+        <w:rPr>
+          <w:lang w:val="en-GB"/>
+        </w:rPr>
+        <w:t>Add the part about image that doesn’t show anything</w:t>
+      </w:r>
+    </w:p>
+    <w:p>
+      <w:pPr>
+        <w:rPr>
+          <w:lang w:val="en-GB"/>
+        </w:rPr>
+      </w:pPr>
+    </w:p>
+    <w:p>
+      <w:pPr>
+        <w:rPr>
+          <w:lang w:val="en-GB"/>
+        </w:rPr>
+      </w:pPr>
+    </w:p>
+    <w:p>
+      <w:pPr>
+        <w:rPr>
+          <w:lang w:val="en-GB"/>
+        </w:rPr>
+      </w:pPr>
+    </w:p>
+    <w:p>
+      <w:pPr>
+        <w:rPr>
+          <w:lang w:val="en-GB"/>
+        </w:rPr>
+      </w:pPr>
+    </w:p>
+    <w:p>
+      <w:pPr>
         <w:pStyle w:val="df3vjf"/>
         <w:numPr>
           <w:ilvl w:val="0"/>
@@ -748,6 +890,7 @@
           <w:rFonts w:ascii="Helvetica Neue" w:eastAsiaTheme="majorEastAsia" w:hAnsi="Helvetica Neue"/>
           <w:color w:val="0A0A0A"/>
         </w:rPr>
+        <w:lastRenderedPageBreak/>
         <w:t>Skin Cancers (Malignant):</w:t>
       </w:r>
       <w:r>
@@ -829,7 +972,7 @@
                     </pic:cNvPicPr>
                   </pic:nvPicPr>
                   <pic:blipFill>
-                    <a:blip r:embed="rId13">
+                    <a:blip r:embed="rId14">
                       <a:extLst>
                         <a:ext uri="{28A0092B-C50C-407E-A947-70E740481C1C}">
                           <a14:useLocalDpi xmlns:a14="http://schemas.microsoft.com/office/drawing/2010/main" val="0"/>
@@ -972,7 +1115,6 @@
         <w:rPr>
           <w:lang w:val="en-GB"/>
         </w:rPr>
-        <w:lastRenderedPageBreak/>
         <w:t>LOOKING AT THE PICTURES OF MALIGNANT CANCER</w:t>
       </w:r>
     </w:p>
@@ -1042,7 +1184,7 @@
                           <pic:cNvPicPr/>
                         </pic:nvPicPr>
                         <pic:blipFill>
-                          <a:blip r:embed="rId14" cstate="print">
+                          <a:blip r:embed="rId15" cstate="print">
                             <a:extLst>
                               <a:ext uri="{28A0092B-C50C-407E-A947-70E740481C1C}">
                                 <a14:useLocalDpi xmlns:a14="http://schemas.microsoft.com/office/drawing/2010/main" val="0"/>
@@ -1102,7 +1244,7 @@
                           <pic:cNvPicPr/>
                         </pic:nvPicPr>
                         <pic:blipFill>
-                          <a:blip r:embed="rId15" cstate="print">
+                          <a:blip r:embed="rId16" cstate="print">
                             <a:extLst>
                               <a:ext uri="{28A0092B-C50C-407E-A947-70E740481C1C}">
                                 <a14:useLocalDpi xmlns:a14="http://schemas.microsoft.com/office/drawing/2010/main" val="0"/>
@@ -1162,7 +1304,7 @@
                           <pic:cNvPicPr/>
                         </pic:nvPicPr>
                         <pic:blipFill>
-                          <a:blip r:embed="rId16" cstate="print">
+                          <a:blip r:embed="rId17" cstate="print">
                             <a:extLst>
                               <a:ext uri="{28A0092B-C50C-407E-A947-70E740481C1C}">
                                 <a14:useLocalDpi xmlns:a14="http://schemas.microsoft.com/office/drawing/2010/main" val="0"/>
@@ -1269,7 +1411,7 @@
                           <pic:cNvPicPr/>
                         </pic:nvPicPr>
                         <pic:blipFill>
-                          <a:blip r:embed="rId17" cstate="print">
+                          <a:blip r:embed="rId18" cstate="print">
                             <a:extLst>
                               <a:ext uri="{28A0092B-C50C-407E-A947-70E740481C1C}">
                                 <a14:useLocalDpi xmlns:a14="http://schemas.microsoft.com/office/drawing/2010/main" val="0"/>
@@ -1329,7 +1471,7 @@
                           <pic:cNvPicPr/>
                         </pic:nvPicPr>
                         <pic:blipFill>
-                          <a:blip r:embed="rId18" cstate="print">
+                          <a:blip r:embed="rId19" cstate="print">
                             <a:extLst>
                               <a:ext uri="{28A0092B-C50C-407E-A947-70E740481C1C}">
                                 <a14:useLocalDpi xmlns:a14="http://schemas.microsoft.com/office/drawing/2010/main" val="0"/>
@@ -1388,7 +1530,7 @@
                           <pic:cNvPicPr/>
                         </pic:nvPicPr>
                         <pic:blipFill>
-                          <a:blip r:embed="rId19" cstate="print">
+                          <a:blip r:embed="rId20" cstate="print">
                             <a:extLst>
                               <a:ext uri="{28A0092B-C50C-407E-A947-70E740481C1C}">
                                 <a14:useLocalDpi xmlns:a14="http://schemas.microsoft.com/office/drawing/2010/main" val="0"/>
@@ -1448,7 +1590,7 @@
                           <pic:cNvPicPr/>
                         </pic:nvPicPr>
                         <pic:blipFill>
-                          <a:blip r:embed="rId20" cstate="print">
+                          <a:blip r:embed="rId21" cstate="print">
                             <a:extLst>
                               <a:ext uri="{28A0092B-C50C-407E-A947-70E740481C1C}">
                                 <a14:useLocalDpi xmlns:a14="http://schemas.microsoft.com/office/drawing/2010/main" val="0"/>
@@ -1508,7 +1650,7 @@
                           <pic:cNvPicPr/>
                         </pic:nvPicPr>
                         <pic:blipFill>
-                          <a:blip r:embed="rId21">
+                          <a:blip r:embed="rId22">
                             <a:extLst>
                               <a:ext uri="{28A0092B-C50C-407E-A947-70E740481C1C}">
                                 <a14:useLocalDpi xmlns:a14="http://schemas.microsoft.com/office/drawing/2010/main" val="0"/>
@@ -1590,7 +1732,7 @@
                           <pic:cNvPicPr/>
                         </pic:nvPicPr>
                         <pic:blipFill>
-                          <a:blip r:embed="rId22" cstate="print">
+                          <a:blip r:embed="rId23" cstate="print">
                             <a:extLst>
                               <a:ext uri="{28A0092B-C50C-407E-A947-70E740481C1C}">
                                 <a14:useLocalDpi xmlns:a14="http://schemas.microsoft.com/office/drawing/2010/main" val="0"/>
@@ -1649,7 +1791,7 @@
                           <pic:cNvPicPr/>
                         </pic:nvPicPr>
                         <pic:blipFill>
-                          <a:blip r:embed="rId23" cstate="print">
+                          <a:blip r:embed="rId24" cstate="print">
                             <a:extLst>
                               <a:ext uri="{28A0092B-C50C-407E-A947-70E740481C1C}">
                                 <a14:useLocalDpi xmlns:a14="http://schemas.microsoft.com/office/drawing/2010/main" val="0"/>
@@ -1708,7 +1850,7 @@
                           <pic:cNvPicPr/>
                         </pic:nvPicPr>
                         <pic:blipFill>
-                          <a:blip r:embed="rId24" cstate="print">
+                          <a:blip r:embed="rId25" cstate="print">
                             <a:extLst>
                               <a:ext uri="{28A0092B-C50C-407E-A947-70E740481C1C}">
                                 <a14:useLocalDpi xmlns:a14="http://schemas.microsoft.com/office/drawing/2010/main" val="0"/>
@@ -1767,7 +1909,7 @@
                           <pic:cNvPicPr/>
                         </pic:nvPicPr>
                         <pic:blipFill>
-                          <a:blip r:embed="rId25" cstate="print">
+                          <a:blip r:embed="rId26" cstate="print">
                             <a:extLst>
                               <a:ext uri="{28A0092B-C50C-407E-A947-70E740481C1C}">
                                 <a14:useLocalDpi xmlns:a14="http://schemas.microsoft.com/office/drawing/2010/main" val="0"/>
@@ -1826,7 +1968,7 @@
                           <pic:cNvPicPr/>
                         </pic:nvPicPr>
                         <pic:blipFill>
-                          <a:blip r:embed="rId26" cstate="print">
+                          <a:blip r:embed="rId27" cstate="print">
                             <a:extLst>
                               <a:ext uri="{28A0092B-C50C-407E-A947-70E740481C1C}">
                                 <a14:useLocalDpi xmlns:a14="http://schemas.microsoft.com/office/drawing/2010/main" val="0"/>
@@ -1895,6 +2037,7 @@
                 <w:noProof/>
                 <w:lang w:val="en-GB"/>
               </w:rPr>
+              <w:lastRenderedPageBreak/>
               <w:drawing>
                 <wp:inline distT="0" distB="0" distL="0" distR="0" wp14:anchorId="44574607" wp14:editId="6D9E70DA">
                   <wp:extent cx="952500" cy="952500"/>
@@ -1911,7 +2054,7 @@
                           <pic:cNvPicPr/>
                         </pic:nvPicPr>
                         <pic:blipFill>
-                          <a:blip r:embed="rId27" cstate="print">
+                          <a:blip r:embed="rId28" cstate="print">
                             <a:extLst>
                               <a:ext uri="{28A0092B-C50C-407E-A947-70E740481C1C}">
                                 <a14:useLocalDpi xmlns:a14="http://schemas.microsoft.com/office/drawing/2010/main" val="0"/>
@@ -1971,7 +2114,7 @@
                           <pic:cNvPicPr/>
                         </pic:nvPicPr>
                         <pic:blipFill>
-                          <a:blip r:embed="rId28" cstate="print">
+                          <a:blip r:embed="rId29" cstate="print">
                             <a:extLst>
                               <a:ext uri="{28A0092B-C50C-407E-A947-70E740481C1C}">
                                 <a14:useLocalDpi xmlns:a14="http://schemas.microsoft.com/office/drawing/2010/main" val="0"/>
@@ -2031,7 +2174,7 @@
                           <pic:cNvPicPr/>
                         </pic:nvPicPr>
                         <pic:blipFill>
-                          <a:blip r:embed="rId29" cstate="print">
+                          <a:blip r:embed="rId30" cstate="print">
                             <a:extLst>
                               <a:ext uri="{28A0092B-C50C-407E-A947-70E740481C1C}">
                                 <a14:useLocalDpi xmlns:a14="http://schemas.microsoft.com/office/drawing/2010/main" val="0"/>
@@ -2092,7 +2235,7 @@
                           <pic:cNvPicPr/>
                         </pic:nvPicPr>
                         <pic:blipFill>
-                          <a:blip r:embed="rId30" cstate="print">
+                          <a:blip r:embed="rId31" cstate="print">
                             <a:extLst>
                               <a:ext uri="{28A0092B-C50C-407E-A947-70E740481C1C}">
                                 <a14:useLocalDpi xmlns:a14="http://schemas.microsoft.com/office/drawing/2010/main" val="0"/>
@@ -2153,7 +2296,7 @@
                           <pic:cNvPicPr/>
                         </pic:nvPicPr>
                         <pic:blipFill>
-                          <a:blip r:embed="rId31" cstate="print">
+                          <a:blip r:embed="rId32" cstate="print">
                             <a:extLst>
                               <a:ext uri="{28A0092B-C50C-407E-A947-70E740481C1C}">
                                 <a14:useLocalDpi xmlns:a14="http://schemas.microsoft.com/office/drawing/2010/main" val="0"/>
@@ -2323,6 +2466,95 @@
 <file path=word/numbering.xml><?xml version="1.0" encoding="utf-8"?>
 <w:numbering xmlns:wpc="http://schemas.microsoft.com/office/word/2010/wordprocessingCanvas" xmlns:cx="http://schemas.microsoft.com/office/drawing/2014/chartex" xmlns:cx1="http://schemas.microsoft.com/office/drawing/2015/9/8/chartex" xmlns:cx2="http://schemas.microsoft.com/office/drawing/2015/10/21/chartex" xmlns:cx3="http://schemas.microsoft.com/office/drawing/2016/5/9/chartex" xmlns:cx4="http://schemas.microsoft.com/office/drawing/2016/5/10/chartex" xmlns:cx5="http://schemas.microsoft.com/office/drawing/2016/5/11/chartex" xmlns:cx6="http://schemas.microsoft.com/office/drawing/2016/5/12/chartex" xmlns:cx7="http://schemas.microsoft.com/office/drawing/2016/5/13/chartex" xmlns:cx8="http://schemas.microsoft.com/office/drawing/2016/5/14/chartex" xmlns:mc="http://schemas.openxmlformats.org/markup-compatibility/2006" xmlns:aink="http://schemas.microsoft.com/office/drawing/2016/ink" xmlns:am3d="http://schemas.microsoft.com/office/drawing/2017/model3d" xmlns:o="urn:schemas-microsoft-com:office:office" xmlns:oel="http://schemas.microsoft.com/office/2019/extlst" xmlns:r="http://schemas.openxmlformats.org/officeDocument/2006/relationships" xmlns:m="http://schemas.openxmlformats.org/officeDocument/2006/math" xmlns:v="urn:schemas-microsoft-com:vml" xmlns:wp14="http://schemas.microsoft.com/office/word/2010/wordprocessingDrawing" xmlns:wp="http://schemas.openxmlformats.org/drawingml/2006/wordprocessingDrawing" xmlns:w10="urn:schemas-microsoft-com:office:word" xmlns:w="http://schemas.openxmlformats.org/wordprocessingml/2006/main" xmlns:w14="http://schemas.microsoft.com/office/word/2010/wordml" xmlns:w15="http://schemas.microsoft.com/office/word/2012/wordml" xmlns:w16cex="http://schemas.microsoft.com/office/word/2018/wordml/cex" xmlns:w16cid="http://schemas.microsoft.com/office/word/2016/wordml/cid" xmlns:w16="http://schemas.microsoft.com/office/word/2018/wordml" xmlns:w16du="http://schemas.microsoft.com/office/word/2023/wordml/word16du" xmlns:w16sdtdh="http://schemas.microsoft.com/office/word/2020/wordml/sdtdatahash" xmlns:w16sdtfl="http://schemas.microsoft.com/office/word/2024/wordml/sdtformatlock" xmlns:w16se="http://schemas.microsoft.com/office/word/2015/wordml/symex" xmlns:wpg="http://schemas.microsoft.com/office/word/2010/wordprocessingGroup" xmlns:wpi="http://schemas.microsoft.com/office/word/2010/wordprocessingInk" xmlns:wne="http://schemas.microsoft.com/office/word/2006/wordml" xmlns:wps="http://schemas.microsoft.com/office/word/2010/wordprocessingShape" mc:Ignorable="w14 w15 w16se w16cid w16 w16cex w16sdtdh w16sdtfl w16du wp14">
   <w:abstractNum w:abstractNumId="0" w15:restartNumberingAfterBreak="0">
+    <w:nsid w:val="00764B33"/>
+    <w:multiLevelType w:val="hybridMultilevel"/>
+    <w:tmpl w:val="6A1E7E4C"/>
+    <w:lvl w:ilvl="0" w:tplc="0809000F">
+      <w:start w:val="1"/>
+      <w:numFmt w:val="decimal"/>
+      <w:lvlText w:val="%1."/>
+      <w:lvlJc w:val="left"/>
+      <w:pPr>
+        <w:ind w:left="720" w:hanging="360"/>
+      </w:pPr>
+      <w:rPr>
+        <w:rFonts w:hint="default"/>
+      </w:rPr>
+    </w:lvl>
+    <w:lvl w:ilvl="1" w:tplc="08090019" w:tentative="1">
+      <w:start w:val="1"/>
+      <w:numFmt w:val="lowerLetter"/>
+      <w:lvlText w:val="%2."/>
+      <w:lvlJc w:val="left"/>
+      <w:pPr>
+        <w:ind w:left="1440" w:hanging="360"/>
+      </w:pPr>
+    </w:lvl>
+    <w:lvl w:ilvl="2" w:tplc="0809001B" w:tentative="1">
+      <w:start w:val="1"/>
+      <w:numFmt w:val="lowerRoman"/>
+      <w:lvlText w:val="%3."/>
+      <w:lvlJc w:val="right"/>
+      <w:pPr>
+        <w:ind w:left="2160" w:hanging="180"/>
+      </w:pPr>
+    </w:lvl>
+    <w:lvl w:ilvl="3" w:tplc="0809000F" w:tentative="1">
+      <w:start w:val="1"/>
+      <w:numFmt w:val="decimal"/>
+      <w:lvlText w:val="%4."/>
+      <w:lvlJc w:val="left"/>
+      <w:pPr>
+        <w:ind w:left="2880" w:hanging="360"/>
+      </w:pPr>
+    </w:lvl>
+    <w:lvl w:ilvl="4" w:tplc="08090019" w:tentative="1">
+      <w:start w:val="1"/>
+      <w:numFmt w:val="lowerLetter"/>
+      <w:lvlText w:val="%5."/>
+      <w:lvlJc w:val="left"/>
+      <w:pPr>
+        <w:ind w:left="3600" w:hanging="360"/>
+      </w:pPr>
+    </w:lvl>
+    <w:lvl w:ilvl="5" w:tplc="0809001B" w:tentative="1">
+      <w:start w:val="1"/>
+      <w:numFmt w:val="lowerRoman"/>
+      <w:lvlText w:val="%6."/>
+      <w:lvlJc w:val="right"/>
+      <w:pPr>
+        <w:ind w:left="4320" w:hanging="180"/>
+      </w:pPr>
+    </w:lvl>
+    <w:lvl w:ilvl="6" w:tplc="0809000F" w:tentative="1">
+      <w:start w:val="1"/>
+      <w:numFmt w:val="decimal"/>
+      <w:lvlText w:val="%7."/>
+      <w:lvlJc w:val="left"/>
+      <w:pPr>
+        <w:ind w:left="5040" w:hanging="360"/>
+      </w:pPr>
+    </w:lvl>
+    <w:lvl w:ilvl="7" w:tplc="08090019" w:tentative="1">
+      <w:start w:val="1"/>
+      <w:numFmt w:val="lowerLetter"/>
+      <w:lvlText w:val="%8."/>
+      <w:lvlJc w:val="left"/>
+      <w:pPr>
+        <w:ind w:left="5760" w:hanging="360"/>
+      </w:pPr>
+    </w:lvl>
+    <w:lvl w:ilvl="8" w:tplc="0809001B" w:tentative="1">
+      <w:start w:val="1"/>
+      <w:numFmt w:val="lowerRoman"/>
+      <w:lvlText w:val="%9."/>
+      <w:lvlJc w:val="right"/>
+      <w:pPr>
+        <w:ind w:left="6480" w:hanging="180"/>
+      </w:pPr>
+    </w:lvl>
+  </w:abstractNum>
+  <w:abstractNum w:abstractNumId="1" w15:restartNumberingAfterBreak="0">
     <w:nsid w:val="35C758A0"/>
     <w:multiLevelType w:val="multilevel"/>
     <w:tmpl w:val="3856BFE8"/>
@@ -2472,6 +2704,9 @@
     </w:lvl>
   </w:abstractNum>
   <w:num w:numId="1" w16cid:durableId="1320113013">
+    <w:abstractNumId w:val="1"/>
+  </w:num>
+  <w:num w:numId="2" w16cid:durableId="1047022394">
     <w:abstractNumId w:val="0"/>
   </w:num>
 </w:numbering>
@@ -2486,7 +2721,7 @@
         <w:kern w:val="2"/>
         <w:sz w:val="24"/>
         <w:szCs w:val="24"/>
-        <w:lang w:val="en-IT" w:eastAsia="en-US" w:bidi="ar-SA"/>
+        <w:lang w:eastAsia="en-US" w:bidi="ar-SA"/>
         <w14:ligatures w14:val="standardContextual"/>
       </w:rPr>
     </w:rPrDefault>

</xml_diff>

<commit_message>
Updated version of the main report, with the finished first point and manual picture analysis
</commit_message>
<xml_diff>
--- a/results/reports/final_report.docx
+++ b/results/reports/final_report.docx
@@ -14,7 +14,64 @@
         <w:t>Preliminary Assignment Summary</w:t>
       </w:r>
     </w:p>
-    <w:p/>
+    <w:p>
+      <w:r>
+        <w:t>Our group’s analysis was precisely focused on getting information about what each type of cancerous skin lesion. In this summary we will discuss about:</w:t>
+      </w:r>
+    </w:p>
+    <w:p>
+      <w:pPr>
+        <w:pStyle w:val="ListParagraph"/>
+        <w:numPr>
+          <w:ilvl w:val="0"/>
+          <w:numId w:val="3"/>
+        </w:numPr>
+      </w:pPr>
+      <w:r>
+        <w:t>Quality of the data</w:t>
+      </w:r>
+    </w:p>
+    <w:p>
+      <w:pPr>
+        <w:pStyle w:val="ListParagraph"/>
+        <w:numPr>
+          <w:ilvl w:val="0"/>
+          <w:numId w:val="3"/>
+        </w:numPr>
+      </w:pPr>
+      <w:r>
+        <w:t>Manual picture analysis</w:t>
+      </w:r>
+    </w:p>
+    <w:p>
+      <w:pPr>
+        <w:pStyle w:val="ListParagraph"/>
+        <w:numPr>
+          <w:ilvl w:val="0"/>
+          <w:numId w:val="3"/>
+        </w:numPr>
+      </w:pPr>
+      <w:r>
+        <w:t>Metadata analysis</w:t>
+      </w:r>
+    </w:p>
+    <w:p>
+      <w:pPr>
+        <w:pStyle w:val="ListParagraph"/>
+        <w:numPr>
+          <w:ilvl w:val="0"/>
+          <w:numId w:val="3"/>
+        </w:numPr>
+      </w:pPr>
+      <w:r>
+        <w:t>Annotation agreement</w:t>
+      </w:r>
+    </w:p>
+    <w:p>
+      <w:pPr>
+        <w:pStyle w:val="ListParagraph"/>
+      </w:pPr>
+    </w:p>
     <w:p>
       <w:pPr>
         <w:pStyle w:val="ListParagraph"/>
@@ -507,20 +564,9 @@
         </w:drawing>
       </w:r>
     </w:p>
-    <w:p/>
     <w:p>
-      <w:r>
-        <w:tab/>
-      </w:r>
-    </w:p>
-    <w:p/>
-    <w:p/>
-    <w:p>
       <w:pPr>
         <w:ind w:firstLine="720"/>
-        <w:rPr>
-          <w:u w:val="single"/>
-        </w:rPr>
       </w:pPr>
       <w:r>
         <w:rPr>
@@ -602,7 +648,7 @@
           <w:u w:val="single"/>
         </w:rPr>
         <w:drawing>
-          <wp:inline distT="0" distB="0" distL="0" distR="0" wp14:anchorId="3FE1A66C" wp14:editId="0FD837AA">
+          <wp:inline distT="0" distB="0" distL="0" distR="0" wp14:anchorId="3FE1A66C" wp14:editId="4B5EEE2A">
             <wp:extent cx="1115568" cy="1115568"/>
             <wp:effectExtent l="0" t="0" r="2540" b="2540"/>
             <wp:docPr id="1428853732" name="Picture 2" descr="A white object in the middle of a black background&#10;&#10;AI-generated content may be incorrect."/>
@@ -753,45 +799,131 @@
       </w:r>
     </w:p>
     <w:p/>
+    <w:p>
+      <w:pPr>
+        <w:rPr>
+          <w:u w:val="single"/>
+        </w:rPr>
+      </w:pPr>
+      <w:r>
+        <w:tab/>
+      </w:r>
+      <w:r>
+        <w:rPr>
+          <w:u w:val="single"/>
+        </w:rPr>
+        <w:t>Metadata:</w:t>
+      </w:r>
+    </w:p>
+    <w:p>
+      <w:r>
+        <w:t>The flaw of the metadata is that there are some missing values/information regarding some personal information about the patients (smoking, drinking, origin of parents, gender, etc.). The absence of this information can mislead the diagnosis of each patient and most importantly the analysis of the whole sample group</w:t>
+      </w:r>
+      <w:r>
+        <w:t xml:space="preserve"> will probably give inaccurate statistic</w:t>
+      </w:r>
+      <w:r>
+        <w:t>.</w:t>
+      </w:r>
+      <w:r>
+        <w:t xml:space="preserve"> </w:t>
+      </w:r>
+    </w:p>
+    <w:p>
+      <w:pPr>
+        <w:rPr>
+          <w:u w:val="single"/>
+        </w:rPr>
+      </w:pPr>
+      <w:r>
+        <w:rPr>
+          <w:u w:val="single"/>
+        </w:rPr>
+        <w:t>Our hypothesis:</w:t>
+      </w:r>
+    </w:p>
+    <w:p>
+      <w:r>
+        <w:tab/>
+        <w:t xml:space="preserve">After reviewing the dataset, we observed that every patient with missing information has a benign skin disease. We conclude </w:t>
+      </w:r>
+      <w:r>
+        <w:t>that since these cases are not associated with skin cancer condition, the missing data is likely less relevant for diagnosis, which could explain why this information was not systematically collected.</w:t>
+      </w:r>
+    </w:p>
     <w:p/>
+    <w:p>
+      <w:r>
+        <w:tab/>
+      </w:r>
+    </w:p>
     <w:p/>
-    <w:p/>
+    <w:p>
+      <w:pPr>
+        <w:pStyle w:val="df3vjf"/>
+        <w:spacing w:before="0" w:beforeAutospacing="0" w:after="180" w:afterAutospacing="0" w:line="360" w:lineRule="atLeast"/>
+        <w:rPr>
+          <w:rStyle w:val="Strong"/>
+          <w:rFonts w:ascii="Helvetica Neue" w:hAnsi="Helvetica Neue"/>
+          <w:b w:val="0"/>
+          <w:bCs w:val="0"/>
+          <w:color w:val="0A0A0A"/>
+        </w:rPr>
+      </w:pPr>
+    </w:p>
     <w:p>
       <w:pPr>
         <w:pStyle w:val="df3vjf"/>
         <w:numPr>
           <w:ilvl w:val="0"/>
-          <w:numId w:val="1"/>
+          <w:numId w:val="2"/>
         </w:numPr>
         <w:spacing w:before="0" w:beforeAutospacing="0" w:after="180" w:afterAutospacing="0" w:line="360" w:lineRule="atLeast"/>
         <w:rPr>
+          <w:rStyle w:val="Strong"/>
           <w:rFonts w:ascii="Helvetica Neue" w:hAnsi="Helvetica Neue"/>
+          <w:b w:val="0"/>
+          <w:bCs w:val="0"/>
           <w:color w:val="0A0A0A"/>
+          <w:sz w:val="32"/>
+          <w:szCs w:val="32"/>
         </w:rPr>
       </w:pPr>
       <w:r>
         <w:rPr>
           <w:rStyle w:val="Strong"/>
-          <w:rFonts w:ascii="Helvetica Neue" w:eastAsiaTheme="majorEastAsia" w:hAnsi="Helvetica Neue"/>
+          <w:rFonts w:ascii="Helvetica Neue" w:hAnsi="Helvetica Neue"/>
+          <w:b w:val="0"/>
+          <w:bCs w:val="0"/>
           <w:color w:val="0A0A0A"/>
-        </w:rPr>
-        <w:t>Skin Diseases (Benign):</w:t>
-      </w:r>
-      <w:r>
-        <w:rPr>
-          <w:rStyle w:val="apple-converted-space"/>
-          <w:rFonts w:ascii="Helvetica Neue" w:eastAsiaTheme="majorEastAsia" w:hAnsi="Helvetica Neue"/>
+          <w:sz w:val="32"/>
+          <w:szCs w:val="32"/>
+        </w:rPr>
+        <w:lastRenderedPageBreak/>
+        <w:t>Manual picture analysis</w:t>
+      </w:r>
+    </w:p>
+    <w:p>
+      <w:pPr>
+        <w:pStyle w:val="df3vjf"/>
+        <w:spacing w:before="0" w:beforeAutospacing="0" w:after="180" w:afterAutospacing="0" w:line="360" w:lineRule="atLeast"/>
+        <w:rPr>
+          <w:rStyle w:val="Strong"/>
+          <w:rFonts w:ascii="Helvetica Neue" w:hAnsi="Helvetica Neue"/>
+          <w:b w:val="0"/>
+          <w:bCs w:val="0"/>
           <w:color w:val="0A0A0A"/>
         </w:rPr>
-        <w:t> </w:t>
-      </w:r>
-      <w:r>
-        <w:rPr>
-          <w:rStyle w:val="t286pc"/>
-          <w:rFonts w:ascii="Helvetica Neue" w:eastAsiaTheme="majorEastAsia" w:hAnsi="Helvetica Neue"/>
+      </w:pPr>
+      <w:r>
+        <w:rPr>
+          <w:rStyle w:val="Strong"/>
+          <w:rFonts w:ascii="Helvetica Neue" w:hAnsi="Helvetica Neue"/>
+          <w:b w:val="0"/>
+          <w:bCs w:val="0"/>
           <w:color w:val="0A0A0A"/>
         </w:rPr>
-        <w:t>Actinic Keratosis (ACK), Nevus (NEV), and Seborrheic Keratosis (SEK).</w:t>
+        <w:t>We analysed the pictures manually and concluded the following features for each diagnosis:</w:t>
       </w:r>
     </w:p>
     <w:p>
@@ -799,45 +931,129 @@
         <w:pStyle w:val="df3vjf"/>
         <w:numPr>
           <w:ilvl w:val="0"/>
-          <w:numId w:val="1"/>
+          <w:numId w:val="4"/>
         </w:numPr>
         <w:spacing w:before="0" w:beforeAutospacing="0" w:after="180" w:afterAutospacing="0" w:line="360" w:lineRule="atLeast"/>
         <w:rPr>
-          <w:rStyle w:val="vkekvd"/>
-          <w:rFonts w:eastAsiaTheme="majorEastAsia"/>
-        </w:rPr>
-      </w:pPr>
-      <w:r>
-        <w:rPr>
           <w:rStyle w:val="Strong"/>
-          <w:rFonts w:ascii="Helvetica Neue" w:eastAsiaTheme="majorEastAsia" w:hAnsi="Helvetica Neue"/>
+          <w:rFonts w:ascii="Helvetica Neue" w:hAnsi="Helvetica Neue"/>
+          <w:b w:val="0"/>
+          <w:bCs w:val="0"/>
           <w:color w:val="0A0A0A"/>
         </w:rPr>
-        <w:t>Skin Cancers (Malignant):</w:t>
-      </w:r>
-      <w:r>
-        <w:rPr>
-          <w:rStyle w:val="apple-converted-space"/>
-          <w:rFonts w:ascii="Helvetica Neue" w:eastAsiaTheme="majorEastAsia" w:hAnsi="Helvetica Neue"/>
+      </w:pPr>
+      <w:r>
+        <w:rPr>
+          <w:rStyle w:val="Strong"/>
+          <w:rFonts w:ascii="Helvetica Neue" w:hAnsi="Helvetica Neue"/>
+          <w:b w:val="0"/>
+          <w:bCs w:val="0"/>
           <w:color w:val="0A0A0A"/>
         </w:rPr>
-        <w:t> </w:t>
-      </w:r>
-      <w:r>
-        <w:rPr>
-          <w:rStyle w:val="t286pc"/>
-          <w:rFonts w:ascii="Helvetica Neue" w:eastAsiaTheme="majorEastAsia" w:hAnsi="Helvetica Neue"/>
+        <w:t xml:space="preserve">MEL: </w:t>
+      </w:r>
+      <w:r>
+        <w:rPr>
+          <w:rStyle w:val="Strong"/>
+          <w:rFonts w:ascii="Helvetica Neue" w:hAnsi="Helvetica Neue"/>
+          <w:b w:val="0"/>
+          <w:bCs w:val="0"/>
           <w:color w:val="0A0A0A"/>
         </w:rPr>
-        <w:t>Basal Cell Carcinoma (BCC), Squamous Cell Carcinoma (SCC), and Melanoma (MEL).</w:t>
-      </w:r>
-      <w:r>
-        <w:rPr>
-          <w:rStyle w:val="vkekvd"/>
-          <w:rFonts w:ascii="Helvetica Neue" w:eastAsiaTheme="majorEastAsia" w:hAnsi="Helvetica Neue"/>
+        <w:t>Very dark and intense pigment with rough and as</w:t>
+      </w:r>
+      <w:r>
+        <w:rPr>
+          <w:rStyle w:val="Strong"/>
+          <w:rFonts w:ascii="Helvetica Neue" w:hAnsi="Helvetica Neue"/>
+          <w:b w:val="0"/>
+          <w:bCs w:val="0"/>
           <w:color w:val="0A0A0A"/>
         </w:rPr>
-        <w:t> </w:t>
+        <w:t>ymmetrical shape</w:t>
+      </w:r>
+      <w:r>
+        <w:rPr>
+          <w:rStyle w:val="Strong"/>
+          <w:rFonts w:ascii="Helvetica Neue" w:hAnsi="Helvetica Neue"/>
+          <w:b w:val="0"/>
+          <w:bCs w:val="0"/>
+          <w:color w:val="0A0A0A"/>
+        </w:rPr>
+        <w:t>, often not crust</w:t>
+      </w:r>
+    </w:p>
+    <w:p>
+      <w:pPr>
+        <w:pStyle w:val="ListParagraph"/>
+        <w:numPr>
+          <w:ilvl w:val="0"/>
+          <w:numId w:val="4"/>
+        </w:numPr>
+      </w:pPr>
+      <w:r>
+        <w:rPr>
+          <w:rFonts w:ascii="Helvetica Neue" w:hAnsi="Helvetica Neue"/>
+          <w:color w:val="0A0A0A"/>
+        </w:rPr>
+        <w:t>BCC:</w:t>
+      </w:r>
+      <w:r>
+        <w:rPr>
+          <w:rFonts w:ascii="Helvetica Neue" w:hAnsi="Helvetica Neue"/>
+          <w:color w:val="0A0A0A"/>
+        </w:rPr>
+        <w:t xml:space="preserve"> </w:t>
+      </w:r>
+      <w:r>
+        <w:t>R</w:t>
+      </w:r>
+      <w:r>
+        <w:t>ound</w:t>
+      </w:r>
+      <w:r>
+        <w:t xml:space="preserve"> shape with a black dot </w:t>
+      </w:r>
+      <w:r>
+        <w:t xml:space="preserve">in the centre, </w:t>
+      </w:r>
+      <w:r>
+        <w:t>often has relief and visible blood vessels.</w:t>
+      </w:r>
+    </w:p>
+    <w:p>
+      <w:pPr>
+        <w:pStyle w:val="df3vjf"/>
+        <w:numPr>
+          <w:ilvl w:val="0"/>
+          <w:numId w:val="4"/>
+        </w:numPr>
+        <w:spacing w:before="0" w:beforeAutospacing="0" w:after="180" w:afterAutospacing="0" w:line="360" w:lineRule="atLeast"/>
+        <w:rPr>
+          <w:rFonts w:ascii="Helvetica Neue" w:hAnsi="Helvetica Neue"/>
+          <w:color w:val="0A0A0A"/>
+        </w:rPr>
+      </w:pPr>
+      <w:r>
+        <w:rPr>
+          <w:rFonts w:ascii="Helvetica Neue" w:hAnsi="Helvetica Neue"/>
+          <w:color w:val="0A0A0A"/>
+        </w:rPr>
+        <w:t>SCC:</w:t>
+      </w:r>
+      <w:r>
+        <w:rPr>
+          <w:rFonts w:ascii="Helvetica Neue" w:hAnsi="Helvetica Neue"/>
+          <w:color w:val="0A0A0A"/>
+        </w:rPr>
+        <w:t xml:space="preserve"> Often skin shed and scar-like shape</w:t>
+      </w:r>
+      <w:r>
+        <w:rPr>
+          <w:rFonts w:ascii="Helvetica Neue" w:hAnsi="Helvetica Neue"/>
+          <w:color w:val="0A0A0A"/>
+        </w:rPr>
+        <w:t>d, mainly skin-coloured</w:t>
       </w:r>
     </w:p>
     <w:p>
@@ -846,119 +1062,10 @@
         <w:spacing w:before="0" w:beforeAutospacing="0" w:after="180" w:afterAutospacing="0" w:line="360" w:lineRule="atLeast"/>
         <w:ind w:left="720"/>
         <w:rPr>
-          <w:rFonts w:eastAsiaTheme="majorEastAsia"/>
-        </w:rPr>
-      </w:pPr>
-      <w:r>
-        <w:rPr>
           <w:rFonts w:ascii="Helvetica Neue" w:hAnsi="Helvetica Neue"/>
           <w:color w:val="0A0A0A"/>
         </w:rPr>
-        <w:fldChar w:fldCharType="begin"/>
-      </w:r>
-      <w:r>
-        <w:rPr>
-          <w:rFonts w:ascii="Helvetica Neue" w:hAnsi="Helvetica Neue"/>
-          <w:color w:val="0A0A0A"/>
-        </w:rPr>
-        <w:instrText xml:space="preserve"> INCLUDEPICTURE "/Users/vale/Library/Group Containers/UBF8T346G9.ms/WebArchiveCopyPasteTempFiles/com.microsoft.Word/api.isic-archive.com&amp;client=AIM&amp;size=128&amp;type=FAVICON&amp;fallback_opts=TYPE,SIZE,URL" \* MERGEFORMATINET </w:instrText>
-      </w:r>
-      <w:r>
-        <w:rPr>
-          <w:rFonts w:ascii="Helvetica Neue" w:hAnsi="Helvetica Neue"/>
-          <w:color w:val="0A0A0A"/>
-        </w:rPr>
-        <w:fldChar w:fldCharType="separate"/>
-      </w:r>
-      <w:r>
-        <w:rPr>
-          <w:rFonts w:ascii="Helvetica Neue" w:hAnsi="Helvetica Neue"/>
-          <w:noProof/>
-          <w:color w:val="0A0A0A"/>
-        </w:rPr>
-        <w:drawing>
-          <wp:inline distT="0" distB="0" distL="0" distR="0" wp14:anchorId="6DEA0966" wp14:editId="73A2D75E">
-            <wp:extent cx="203200" cy="203200"/>
-            <wp:effectExtent l="0" t="0" r="0" b="0"/>
-            <wp:docPr id="77146136" name="Picture 1" descr="ISIC | International Skin Imaging Collaboration"/>
-            <wp:cNvGraphicFramePr>
-              <a:graphicFrameLocks xmlns:a="http://schemas.openxmlformats.org/drawingml/2006/main" noChangeAspect="1"/>
-            </wp:cNvGraphicFramePr>
-            <a:graphic xmlns:a="http://schemas.openxmlformats.org/drawingml/2006/main">
-              <a:graphicData uri="http://schemas.openxmlformats.org/drawingml/2006/picture">
-                <pic:pic xmlns:pic="http://schemas.openxmlformats.org/drawingml/2006/picture">
-                  <pic:nvPicPr>
-                    <pic:cNvPr id="0" name="img-9MaeaYW7B8ybwPAPzvuWmQU_5" descr="ISIC | International Skin Imaging Collaboration"/>
-                    <pic:cNvPicPr>
-                      <a:picLocks noChangeAspect="1" noChangeArrowheads="1"/>
-                    </pic:cNvPicPr>
-                  </pic:nvPicPr>
-                  <pic:blipFill>
-                    <a:blip r:embed="rId16">
-                      <a:extLst>
-                        <a:ext uri="{28A0092B-C50C-407E-A947-70E740481C1C}">
-                          <a14:useLocalDpi xmlns:a14="http://schemas.microsoft.com/office/drawing/2010/main" val="0"/>
-                        </a:ext>
-                      </a:extLst>
-                    </a:blip>
-                    <a:srcRect/>
-                    <a:stretch>
-                      <a:fillRect/>
-                    </a:stretch>
-                  </pic:blipFill>
-                  <pic:spPr bwMode="auto">
-                    <a:xfrm>
-                      <a:off x="0" y="0"/>
-                      <a:ext cx="203200" cy="203200"/>
-                    </a:xfrm>
-                    <a:prstGeom prst="rect">
-                      <a:avLst/>
-                    </a:prstGeom>
-                    <a:noFill/>
-                    <a:ln>
-                      <a:noFill/>
-                    </a:ln>
-                  </pic:spPr>
-                </pic:pic>
-              </a:graphicData>
-            </a:graphic>
-          </wp:inline>
-        </w:drawing>
-      </w:r>
-      <w:r>
-        <w:rPr>
-          <w:rFonts w:ascii="Helvetica Neue" w:hAnsi="Helvetica Neue"/>
-          <w:color w:val="0A0A0A"/>
-        </w:rPr>
-        <w:fldChar w:fldCharType="end"/>
-      </w:r>
-      <w:r>
-        <w:rPr>
-          <w:rStyle w:val="ifmvxd"/>
-          <w:rFonts w:ascii="Helvetica Neue" w:eastAsiaTheme="majorEastAsia" w:hAnsi="Helvetica Neue"/>
-          <w:color w:val="0A0A0A"/>
-          <w:sz w:val="17"/>
-          <w:szCs w:val="17"/>
-        </w:rPr>
-        <w:t>ISIC |</w:t>
-      </w:r>
-    </w:p>
-    <w:p/>
-    <w:p/>
-    <w:p/>
-    <w:p/>
-    <w:p/>
-    <w:p/>
-    <w:p/>
-    <w:p/>
-    <w:p/>
-    <w:p/>
-    <w:p/>
-    <w:p/>
-    <w:p>
-      <w:r>
-        <w:t>LOOKING AT THE PICTURES OF MALIGNANT CANCER</w:t>
-      </w:r>
+      </w:pPr>
     </w:p>
     <w:tbl>
       <w:tblPr>
@@ -1012,7 +1119,7 @@
                           <pic:cNvPicPr/>
                         </pic:nvPicPr>
                         <pic:blipFill>
-                          <a:blip r:embed="rId17" cstate="print">
+                          <a:blip r:embed="rId16" cstate="print">
                             <a:extLst>
                               <a:ext uri="{28A0092B-C50C-407E-A947-70E740481C1C}">
                                 <a14:useLocalDpi xmlns:a14="http://schemas.microsoft.com/office/drawing/2010/main" val="0"/>
@@ -1068,7 +1175,7 @@
                           <pic:cNvPicPr/>
                         </pic:nvPicPr>
                         <pic:blipFill>
-                          <a:blip r:embed="rId18" cstate="print">
+                          <a:blip r:embed="rId17" cstate="print">
                             <a:extLst>
                               <a:ext uri="{28A0092B-C50C-407E-A947-70E740481C1C}">
                                 <a14:useLocalDpi xmlns:a14="http://schemas.microsoft.com/office/drawing/2010/main" val="0"/>
@@ -1124,7 +1231,7 @@
                           <pic:cNvPicPr/>
                         </pic:nvPicPr>
                         <pic:blipFill>
-                          <a:blip r:embed="rId19" cstate="print">
+                          <a:blip r:embed="rId18" cstate="print">
                             <a:extLst>
                               <a:ext uri="{28A0092B-C50C-407E-A947-70E740481C1C}">
                                 <a14:useLocalDpi xmlns:a14="http://schemas.microsoft.com/office/drawing/2010/main" val="0"/>
@@ -1207,7 +1314,7 @@
                           <pic:cNvPicPr/>
                         </pic:nvPicPr>
                         <pic:blipFill>
-                          <a:blip r:embed="rId20" cstate="print">
+                          <a:blip r:embed="rId19" cstate="print">
                             <a:extLst>
                               <a:ext uri="{28A0092B-C50C-407E-A947-70E740481C1C}">
                                 <a14:useLocalDpi xmlns:a14="http://schemas.microsoft.com/office/drawing/2010/main" val="0"/>
@@ -1263,7 +1370,7 @@
                           <pic:cNvPicPr/>
                         </pic:nvPicPr>
                         <pic:blipFill>
-                          <a:blip r:embed="rId21" cstate="print">
+                          <a:blip r:embed="rId20" cstate="print">
                             <a:extLst>
                               <a:ext uri="{28A0092B-C50C-407E-A947-70E740481C1C}">
                                 <a14:useLocalDpi xmlns:a14="http://schemas.microsoft.com/office/drawing/2010/main" val="0"/>
@@ -1301,10 +1408,10 @@
                 <w:noProof/>
               </w:rPr>
               <w:drawing>
-                <wp:inline distT="0" distB="0" distL="0" distR="0" wp14:anchorId="52B16C9D" wp14:editId="28462A8B">
-                  <wp:extent cx="965200" cy="965200"/>
+                <wp:inline distT="0" distB="0" distL="0" distR="0" wp14:anchorId="024CA855" wp14:editId="31C85A6E">
+                  <wp:extent cx="968400" cy="968400"/>
                   <wp:effectExtent l="0" t="0" r="0" b="0"/>
-                  <wp:docPr id="2103805004" name="Picture 7" descr="A close up of a wound&#10;&#10;AI-generated content may be incorrect."/>
+                  <wp:docPr id="178335811" name="Picture 1"/>
                   <wp:cNvGraphicFramePr>
                     <a:graphicFrameLocks xmlns:a="http://schemas.openxmlformats.org/drawingml/2006/main" noChangeAspect="1"/>
                   </wp:cNvGraphicFramePr>
@@ -1312,11 +1419,11 @@
                     <a:graphicData uri="http://schemas.openxmlformats.org/drawingml/2006/picture">
                       <pic:pic xmlns:pic="http://schemas.openxmlformats.org/drawingml/2006/picture">
                         <pic:nvPicPr>
-                          <pic:cNvPr id="2103805004" name="Picture 7" descr="A close up of a wound&#10;&#10;AI-generated content may be incorrect."/>
+                          <pic:cNvPr id="178335811" name="Picture 1"/>
                           <pic:cNvPicPr/>
                         </pic:nvPicPr>
                         <pic:blipFill>
-                          <a:blip r:embed="rId22" cstate="print">
+                          <a:blip r:embed="rId21" cstate="print">
                             <a:extLst>
                               <a:ext uri="{28A0092B-C50C-407E-A947-70E740481C1C}">
                                 <a14:useLocalDpi xmlns:a14="http://schemas.microsoft.com/office/drawing/2010/main" val="0"/>
@@ -1330,7 +1437,7 @@
                         <pic:spPr>
                           <a:xfrm>
                             <a:off x="0" y="0"/>
-                            <a:ext cx="965200" cy="965200"/>
+                            <a:ext cx="968400" cy="968400"/>
                           </a:xfrm>
                           <a:prstGeom prst="rect">
                             <a:avLst/>
@@ -1372,7 +1479,7 @@
                           <pic:cNvPicPr/>
                         </pic:nvPicPr>
                         <pic:blipFill>
-                          <a:blip r:embed="rId23" cstate="print">
+                          <a:blip r:embed="rId22" cstate="print">
                             <a:extLst>
                               <a:ext uri="{28A0092B-C50C-407E-A947-70E740481C1C}">
                                 <a14:useLocalDpi xmlns:a14="http://schemas.microsoft.com/office/drawing/2010/main" val="0"/>
@@ -1428,7 +1535,7 @@
                           <pic:cNvPicPr/>
                         </pic:nvPicPr>
                         <pic:blipFill>
-                          <a:blip r:embed="rId24">
+                          <a:blip r:embed="rId23">
                             <a:extLst>
                               <a:ext uri="{28A0092B-C50C-407E-A947-70E740481C1C}">
                                 <a14:useLocalDpi xmlns:a14="http://schemas.microsoft.com/office/drawing/2010/main" val="0"/>
@@ -1496,7 +1603,7 @@
                           <pic:cNvPicPr/>
                         </pic:nvPicPr>
                         <pic:blipFill>
-                          <a:blip r:embed="rId25" cstate="print">
+                          <a:blip r:embed="rId24" cstate="print">
                             <a:extLst>
                               <a:ext uri="{28A0092B-C50C-407E-A947-70E740481C1C}">
                                 <a14:useLocalDpi xmlns:a14="http://schemas.microsoft.com/office/drawing/2010/main" val="0"/>
@@ -1549,7 +1656,7 @@
                           <pic:cNvPicPr/>
                         </pic:nvPicPr>
                         <pic:blipFill>
-                          <a:blip r:embed="rId26" cstate="print">
+                          <a:blip r:embed="rId25" cstate="print">
                             <a:extLst>
                               <a:ext uri="{28A0092B-C50C-407E-A947-70E740481C1C}">
                                 <a14:useLocalDpi xmlns:a14="http://schemas.microsoft.com/office/drawing/2010/main" val="0"/>
@@ -1602,7 +1709,7 @@
                           <pic:cNvPicPr/>
                         </pic:nvPicPr>
                         <pic:blipFill>
-                          <a:blip r:embed="rId27" cstate="print">
+                          <a:blip r:embed="rId26" cstate="print">
                             <a:extLst>
                               <a:ext uri="{28A0092B-C50C-407E-A947-70E740481C1C}">
                                 <a14:useLocalDpi xmlns:a14="http://schemas.microsoft.com/office/drawing/2010/main" val="0"/>
@@ -1655,7 +1762,7 @@
                           <pic:cNvPicPr/>
                         </pic:nvPicPr>
                         <pic:blipFill>
-                          <a:blip r:embed="rId28" cstate="print">
+                          <a:blip r:embed="rId27" cstate="print">
                             <a:extLst>
                               <a:ext uri="{28A0092B-C50C-407E-A947-70E740481C1C}">
                                 <a14:useLocalDpi xmlns:a14="http://schemas.microsoft.com/office/drawing/2010/main" val="0"/>
@@ -1708,7 +1815,7 @@
                           <pic:cNvPicPr/>
                         </pic:nvPicPr>
                         <pic:blipFill>
-                          <a:blip r:embed="rId29" cstate="print">
+                          <a:blip r:embed="rId28" cstate="print">
                             <a:extLst>
                               <a:ext uri="{28A0092B-C50C-407E-A947-70E740481C1C}">
                                 <a14:useLocalDpi xmlns:a14="http://schemas.microsoft.com/office/drawing/2010/main" val="0"/>
@@ -1789,7 +1896,7 @@
                           <pic:cNvPicPr/>
                         </pic:nvPicPr>
                         <pic:blipFill>
-                          <a:blip r:embed="rId30" cstate="print">
+                          <a:blip r:embed="rId29" cstate="print">
                             <a:extLst>
                               <a:ext uri="{28A0092B-C50C-407E-A947-70E740481C1C}">
                                 <a14:useLocalDpi xmlns:a14="http://schemas.microsoft.com/office/drawing/2010/main" val="0"/>
@@ -1847,7 +1954,7 @@
                           <pic:cNvPicPr/>
                         </pic:nvPicPr>
                         <pic:blipFill>
-                          <a:blip r:embed="rId31" cstate="print">
+                          <a:blip r:embed="rId30" cstate="print">
                             <a:extLst>
                               <a:ext uri="{28A0092B-C50C-407E-A947-70E740481C1C}">
                                 <a14:useLocalDpi xmlns:a14="http://schemas.microsoft.com/office/drawing/2010/main" val="0"/>
@@ -1905,7 +2012,7 @@
                           <pic:cNvPicPr/>
                         </pic:nvPicPr>
                         <pic:blipFill>
-                          <a:blip r:embed="rId32" cstate="print">
+                          <a:blip r:embed="rId31" cstate="print">
                             <a:extLst>
                               <a:ext uri="{28A0092B-C50C-407E-A947-70E740481C1C}">
                                 <a14:useLocalDpi xmlns:a14="http://schemas.microsoft.com/office/drawing/2010/main" val="0"/>
@@ -1964,7 +2071,7 @@
                           <pic:cNvPicPr/>
                         </pic:nvPicPr>
                         <pic:blipFill>
-                          <a:blip r:embed="rId33" cstate="print">
+                          <a:blip r:embed="rId32" cstate="print">
                             <a:extLst>
                               <a:ext uri="{28A0092B-C50C-407E-A947-70E740481C1C}">
                                 <a14:useLocalDpi xmlns:a14="http://schemas.microsoft.com/office/drawing/2010/main" val="0"/>
@@ -2023,7 +2130,7 @@
                           <pic:cNvPicPr/>
                         </pic:nvPicPr>
                         <pic:blipFill>
-                          <a:blip r:embed="rId34" cstate="print">
+                          <a:blip r:embed="rId33" cstate="print">
                             <a:extLst>
                               <a:ext uri="{28A0092B-C50C-407E-A947-70E740481C1C}">
                                 <a14:useLocalDpi xmlns:a14="http://schemas.microsoft.com/office/drawing/2010/main" val="0"/>
@@ -2054,40 +2161,6 @@
       </w:tr>
     </w:tbl>
     <w:p/>
-    <w:p>
-      <w:r>
-        <w:t>MELANOMA</w:t>
-      </w:r>
-    </w:p>
-    <w:p>
-      <w:r>
-        <w:t>Dark colour and irregular form</w:t>
-      </w:r>
-    </w:p>
-    <w:p/>
-    <w:p>
-      <w:r>
-        <w:t>BASAL CELL CARCINOMA</w:t>
-      </w:r>
-    </w:p>
-    <w:p>
-      <w:r>
-        <w:lastRenderedPageBreak/>
-        <w:t>Mostly round, dark in the centre, small, very recognizable form</w:t>
-      </w:r>
-    </w:p>
-    <w:p/>
-    <w:p>
-      <w:r>
-        <w:t>SQUAMOUS CELL CARCINOMA</w:t>
-      </w:r>
-    </w:p>
-    <w:p>
-      <w:r>
-        <w:t>Colour similar to the skin, most of them irregular shape, difficult to spot</w:t>
-      </w:r>
-    </w:p>
-    <w:p/>
     <w:p/>
     <w:sectPr>
       <w:pgSz w:w="11906" w:h="16838"/>
@@ -2339,11 +2412,243 @@
       </w:rPr>
     </w:lvl>
   </w:abstractNum>
+  <w:abstractNum w:abstractNumId="2" w15:restartNumberingAfterBreak="0">
+    <w:nsid w:val="692C7AC1"/>
+    <w:multiLevelType w:val="hybridMultilevel"/>
+    <w:tmpl w:val="B1AA5908"/>
+    <w:lvl w:ilvl="0" w:tplc="08090001">
+      <w:start w:val="1"/>
+      <w:numFmt w:val="bullet"/>
+      <w:lvlText w:val=""/>
+      <w:lvlJc w:val="left"/>
+      <w:pPr>
+        <w:ind w:left="720" w:hanging="360"/>
+      </w:pPr>
+      <w:rPr>
+        <w:rFonts w:ascii="Symbol" w:hAnsi="Symbol" w:hint="default"/>
+      </w:rPr>
+    </w:lvl>
+    <w:lvl w:ilvl="1" w:tplc="08090003" w:tentative="1">
+      <w:start w:val="1"/>
+      <w:numFmt w:val="bullet"/>
+      <w:lvlText w:val="o"/>
+      <w:lvlJc w:val="left"/>
+      <w:pPr>
+        <w:ind w:left="1440" w:hanging="360"/>
+      </w:pPr>
+      <w:rPr>
+        <w:rFonts w:ascii="Courier New" w:hAnsi="Courier New" w:cs="Courier New" w:hint="default"/>
+      </w:rPr>
+    </w:lvl>
+    <w:lvl w:ilvl="2" w:tplc="08090005" w:tentative="1">
+      <w:start w:val="1"/>
+      <w:numFmt w:val="bullet"/>
+      <w:lvlText w:val=""/>
+      <w:lvlJc w:val="left"/>
+      <w:pPr>
+        <w:ind w:left="2160" w:hanging="360"/>
+      </w:pPr>
+      <w:rPr>
+        <w:rFonts w:ascii="Wingdings" w:hAnsi="Wingdings" w:hint="default"/>
+      </w:rPr>
+    </w:lvl>
+    <w:lvl w:ilvl="3" w:tplc="08090001" w:tentative="1">
+      <w:start w:val="1"/>
+      <w:numFmt w:val="bullet"/>
+      <w:lvlText w:val=""/>
+      <w:lvlJc w:val="left"/>
+      <w:pPr>
+        <w:ind w:left="2880" w:hanging="360"/>
+      </w:pPr>
+      <w:rPr>
+        <w:rFonts w:ascii="Symbol" w:hAnsi="Symbol" w:hint="default"/>
+      </w:rPr>
+    </w:lvl>
+    <w:lvl w:ilvl="4" w:tplc="08090003" w:tentative="1">
+      <w:start w:val="1"/>
+      <w:numFmt w:val="bullet"/>
+      <w:lvlText w:val="o"/>
+      <w:lvlJc w:val="left"/>
+      <w:pPr>
+        <w:ind w:left="3600" w:hanging="360"/>
+      </w:pPr>
+      <w:rPr>
+        <w:rFonts w:ascii="Courier New" w:hAnsi="Courier New" w:cs="Courier New" w:hint="default"/>
+      </w:rPr>
+    </w:lvl>
+    <w:lvl w:ilvl="5" w:tplc="08090005" w:tentative="1">
+      <w:start w:val="1"/>
+      <w:numFmt w:val="bullet"/>
+      <w:lvlText w:val=""/>
+      <w:lvlJc w:val="left"/>
+      <w:pPr>
+        <w:ind w:left="4320" w:hanging="360"/>
+      </w:pPr>
+      <w:rPr>
+        <w:rFonts w:ascii="Wingdings" w:hAnsi="Wingdings" w:hint="default"/>
+      </w:rPr>
+    </w:lvl>
+    <w:lvl w:ilvl="6" w:tplc="08090001" w:tentative="1">
+      <w:start w:val="1"/>
+      <w:numFmt w:val="bullet"/>
+      <w:lvlText w:val=""/>
+      <w:lvlJc w:val="left"/>
+      <w:pPr>
+        <w:ind w:left="5040" w:hanging="360"/>
+      </w:pPr>
+      <w:rPr>
+        <w:rFonts w:ascii="Symbol" w:hAnsi="Symbol" w:hint="default"/>
+      </w:rPr>
+    </w:lvl>
+    <w:lvl w:ilvl="7" w:tplc="08090003" w:tentative="1">
+      <w:start w:val="1"/>
+      <w:numFmt w:val="bullet"/>
+      <w:lvlText w:val="o"/>
+      <w:lvlJc w:val="left"/>
+      <w:pPr>
+        <w:ind w:left="5760" w:hanging="360"/>
+      </w:pPr>
+      <w:rPr>
+        <w:rFonts w:ascii="Courier New" w:hAnsi="Courier New" w:cs="Courier New" w:hint="default"/>
+      </w:rPr>
+    </w:lvl>
+    <w:lvl w:ilvl="8" w:tplc="08090005" w:tentative="1">
+      <w:start w:val="1"/>
+      <w:numFmt w:val="bullet"/>
+      <w:lvlText w:val=""/>
+      <w:lvlJc w:val="left"/>
+      <w:pPr>
+        <w:ind w:left="6480" w:hanging="360"/>
+      </w:pPr>
+      <w:rPr>
+        <w:rFonts w:ascii="Wingdings" w:hAnsi="Wingdings" w:hint="default"/>
+      </w:rPr>
+    </w:lvl>
+  </w:abstractNum>
+  <w:abstractNum w:abstractNumId="3" w15:restartNumberingAfterBreak="0">
+    <w:nsid w:val="72945DF8"/>
+    <w:multiLevelType w:val="hybridMultilevel"/>
+    <w:tmpl w:val="B694DFD8"/>
+    <w:lvl w:ilvl="0" w:tplc="08090001">
+      <w:start w:val="1"/>
+      <w:numFmt w:val="bullet"/>
+      <w:lvlText w:val=""/>
+      <w:lvlJc w:val="left"/>
+      <w:pPr>
+        <w:ind w:left="720" w:hanging="360"/>
+      </w:pPr>
+      <w:rPr>
+        <w:rFonts w:ascii="Symbol" w:hAnsi="Symbol" w:hint="default"/>
+      </w:rPr>
+    </w:lvl>
+    <w:lvl w:ilvl="1" w:tplc="08090003" w:tentative="1">
+      <w:start w:val="1"/>
+      <w:numFmt w:val="bullet"/>
+      <w:lvlText w:val="o"/>
+      <w:lvlJc w:val="left"/>
+      <w:pPr>
+        <w:ind w:left="1440" w:hanging="360"/>
+      </w:pPr>
+      <w:rPr>
+        <w:rFonts w:ascii="Courier New" w:hAnsi="Courier New" w:cs="Courier New" w:hint="default"/>
+      </w:rPr>
+    </w:lvl>
+    <w:lvl w:ilvl="2" w:tplc="08090005" w:tentative="1">
+      <w:start w:val="1"/>
+      <w:numFmt w:val="bullet"/>
+      <w:lvlText w:val=""/>
+      <w:lvlJc w:val="left"/>
+      <w:pPr>
+        <w:ind w:left="2160" w:hanging="360"/>
+      </w:pPr>
+      <w:rPr>
+        <w:rFonts w:ascii="Wingdings" w:hAnsi="Wingdings" w:hint="default"/>
+      </w:rPr>
+    </w:lvl>
+    <w:lvl w:ilvl="3" w:tplc="08090001" w:tentative="1">
+      <w:start w:val="1"/>
+      <w:numFmt w:val="bullet"/>
+      <w:lvlText w:val=""/>
+      <w:lvlJc w:val="left"/>
+      <w:pPr>
+        <w:ind w:left="2880" w:hanging="360"/>
+      </w:pPr>
+      <w:rPr>
+        <w:rFonts w:ascii="Symbol" w:hAnsi="Symbol" w:hint="default"/>
+      </w:rPr>
+    </w:lvl>
+    <w:lvl w:ilvl="4" w:tplc="08090003" w:tentative="1">
+      <w:start w:val="1"/>
+      <w:numFmt w:val="bullet"/>
+      <w:lvlText w:val="o"/>
+      <w:lvlJc w:val="left"/>
+      <w:pPr>
+        <w:ind w:left="3600" w:hanging="360"/>
+      </w:pPr>
+      <w:rPr>
+        <w:rFonts w:ascii="Courier New" w:hAnsi="Courier New" w:cs="Courier New" w:hint="default"/>
+      </w:rPr>
+    </w:lvl>
+    <w:lvl w:ilvl="5" w:tplc="08090005" w:tentative="1">
+      <w:start w:val="1"/>
+      <w:numFmt w:val="bullet"/>
+      <w:lvlText w:val=""/>
+      <w:lvlJc w:val="left"/>
+      <w:pPr>
+        <w:ind w:left="4320" w:hanging="360"/>
+      </w:pPr>
+      <w:rPr>
+        <w:rFonts w:ascii="Wingdings" w:hAnsi="Wingdings" w:hint="default"/>
+      </w:rPr>
+    </w:lvl>
+    <w:lvl w:ilvl="6" w:tplc="08090001" w:tentative="1">
+      <w:start w:val="1"/>
+      <w:numFmt w:val="bullet"/>
+      <w:lvlText w:val=""/>
+      <w:lvlJc w:val="left"/>
+      <w:pPr>
+        <w:ind w:left="5040" w:hanging="360"/>
+      </w:pPr>
+      <w:rPr>
+        <w:rFonts w:ascii="Symbol" w:hAnsi="Symbol" w:hint="default"/>
+      </w:rPr>
+    </w:lvl>
+    <w:lvl w:ilvl="7" w:tplc="08090003" w:tentative="1">
+      <w:start w:val="1"/>
+      <w:numFmt w:val="bullet"/>
+      <w:lvlText w:val="o"/>
+      <w:lvlJc w:val="left"/>
+      <w:pPr>
+        <w:ind w:left="5760" w:hanging="360"/>
+      </w:pPr>
+      <w:rPr>
+        <w:rFonts w:ascii="Courier New" w:hAnsi="Courier New" w:cs="Courier New" w:hint="default"/>
+      </w:rPr>
+    </w:lvl>
+    <w:lvl w:ilvl="8" w:tplc="08090005" w:tentative="1">
+      <w:start w:val="1"/>
+      <w:numFmt w:val="bullet"/>
+      <w:lvlText w:val=""/>
+      <w:lvlJc w:val="left"/>
+      <w:pPr>
+        <w:ind w:left="6480" w:hanging="360"/>
+      </w:pPr>
+      <w:rPr>
+        <w:rFonts w:ascii="Wingdings" w:hAnsi="Wingdings" w:hint="default"/>
+      </w:rPr>
+    </w:lvl>
+  </w:abstractNum>
   <w:num w:numId="1" w16cid:durableId="1320113013">
     <w:abstractNumId w:val="1"/>
   </w:num>
   <w:num w:numId="2" w16cid:durableId="1047022394">
     <w:abstractNumId w:val="0"/>
+  </w:num>
+  <w:num w:numId="3" w16cid:durableId="196479309">
+    <w:abstractNumId w:val="3"/>
+  </w:num>
+  <w:num w:numId="4" w16cid:durableId="1694068311">
+    <w:abstractNumId w:val="2"/>
   </w:num>
 </w:numbering>
 </file>

</xml_diff>